<commit_message>
WIP checkpoint: agent work in progress
Co-Authored-By: Claude Sonnet 5.5 <noreply@anthropic.com>
Claude-Session: https://claude.ai/code/session_01Wmstm4fTDLXm5Z35vo5Mv2
</commit_message>
<xml_diff>
--- a/outputs/designed/Math_Inquirers_What_Learners_Get.docx
+++ b/outputs/designed/Math_Inquirers_What_Learners_Get.docx
@@ -596,12 +596,12 @@
           <w:rFonts w:ascii="Calibri" w:hAnsi="Calibri"/>
           <w:color w:val="1B2A49"/>
         </w:rPr>
-        <w:t>Planned price (to confirm)</w:t>
+        <w:t>Beta fee</w:t>
       </w:r>
     </w:p>
     <w:p>
       <w:r>
-        <w:t>S$650 per child for the 15-hour programme (S$65 a lesson), with the printed workbook, cut-out kit and all materials included. Introductory price for the first intake: S$500 (S$50 a lesson).</w:t>
+        <w:t>S$250 per child for all 10 lessons (S$25 a lesson), with the printed workbook, cut-out kit and all materials included.</w:t>
       </w:r>
     </w:p>
     <w:sectPr>

</xml_diff>